<commit_message>
fix: drop the company block from the privacy and acceptable use introductions.
Co-authored-by: Cursor <cursoragent@cursor.com>
</commit_message>
<xml_diff>
--- a/legal/Acceptable-Use-Policy.docx
+++ b/legal/Acceptable-Use-Policy.docx
@@ -13,54 +13,6 @@
           <w:b/>
         </w:rPr>
         <w:t xml:space="preserve">Acceptable Use Policy</w:t>
-      </w:r>
-    </w:p>
-    <w:p>
-      <w:pPr>
-        <w:pStyle w:val="Normal"/>
-      </w:pPr>
-      <w:r>
-        <w:rPr>
-          <w:sz w:val="22"/>
-          <w:szCs w:val="22"/>
-        </w:rPr>
-        <w:t xml:space="preserve">Loki</w:t>
-      </w:r>
-    </w:p>
-    <w:p>
-      <w:pPr>
-        <w:pStyle w:val="Normal"/>
-      </w:pPr>
-      <w:r>
-        <w:rPr>
-          <w:sz w:val="22"/>
-          <w:szCs w:val="22"/>
-        </w:rPr>
-        <w:t xml:space="preserve">Reveflo Technologies Limited</w:t>
-      </w:r>
-    </w:p>
-    <w:p>
-      <w:pPr>
-        <w:pStyle w:val="Normal"/>
-      </w:pPr>
-      <w:r>
-        <w:rPr>
-          <w:sz w:val="22"/>
-          <w:szCs w:val="22"/>
-        </w:rPr>
-        <w:t xml:space="preserve">Company number: 74466581</w:t>
-      </w:r>
-    </w:p>
-    <w:p>
-      <w:pPr>
-        <w:pStyle w:val="Normal"/>
-      </w:pPr>
-      <w:r>
-        <w:rPr>
-          <w:sz w:val="22"/>
-          <w:szCs w:val="22"/>
-        </w:rPr>
-        <w:t xml:space="preserve">Registered office: The Chelsea, 69 Jervois Street, Sheung Wan, Hong Kong</w:t>
       </w:r>
     </w:p>
     <w:p>

</xml_diff>